<commit_message>
Giao diện trắng đen, ảnh minh họa, AI Lab giải thích dự đoán (what-if, bản đồ nhiệt từ, dải đa chủ đề), phân tích lỗi
Co-Authored-By: Claude Sonnet 5.5 <noreply@anthropic.com>
Claude-Session: https://claude.ai/code/session_01Nj2UpofxGqzA7C2PaZbXvA
</commit_message>
<xml_diff>
--- a/BAO_CAO_DO_AN.docx
+++ b/BAO_CAO_DO_AN.docx
@@ -1543,7 +1543,65 @@
         <w:pStyle w:val="Heading1"/>
       </w:pPr>
       <w:r>
-        <w:t>6. Hạn chế và hướng phát triển</w:t>
+        <w:t>6. Hệ thống web và chức năng nổi bật</w:t>
+      </w:r>
+    </w:p>
+    <w:p>
+      <w:r>
+        <w:t>Mô hình được đóng gói thành website tin tức VnNews (Flask) gồm: trang chủ, 11 chuyên mục, trang đọc bài, tìm kiếm TF-IDF, công cụ phân loại (văn bản/đường link), trang thống kê và giới thiệu. Toàn bộ 5.500 bài được mô hình tự động gán chuyên mục; các chỉ số độ chính xác chỉ tính trên tập kiểm thử.</w:t>
+      </w:r>
+    </w:p>
+    <w:p>
+      <w:pPr>
+        <w:pStyle w:val="Heading2"/>
+      </w:pPr>
+      <w:r>
+        <w:t>6.1 AI Lab – giải thích dự đoán (Explainable AI)</w:t>
+      </w:r>
+    </w:p>
+    <w:p>
+      <w:r>
+        <w:t>Điểm khác biệt của đồ án là chức năng giải thích vì sao mô hình chọn một chủ đề. Vì Linear SVM là mô hình tuyến tính, điểm của mỗi chủ đề bằng tổng (trọng số × giá trị TF-IDF) nên có thể tách chính xác phần đóng góp của từng từ và cụm hai từ mà không cần xấp xỉ như LIME/SHAP. Đóng góp của một từ = (trọng số chủ đề dự đoán − trọng số trung bình các chủ đề còn lại) × TF-IDF.</w:t>
+      </w:r>
+    </w:p>
+    <w:p>
+      <w:pPr>
+        <w:pStyle w:val="ListBullet"/>
+      </w:pPr>
+      <w:r>
+        <w:t>Bản đồ nhiệt từ ngữ: mỗi từ trong bài được tô đậm theo mức ủng hộ chủ đề dự đoán; từ đi ngược được gạch chấm.</w:t>
+      </w:r>
+    </w:p>
+    <w:p>
+      <w:pPr>
+        <w:pStyle w:val="ListBullet"/>
+      </w:pPr>
+      <w:r>
+        <w:t>What-if: người dùng bấm bỏ một từ, hệ thống dự đoán lại ngay và cho biết xác suất thay đổi bao nhiêu hoặc chủ đề có bị đổi không (ví dụ bỏ các từ thể thao thì bài chuyển sang Kinh doanh).</w:t>
+      </w:r>
+    </w:p>
+    <w:p>
+      <w:pPr>
+        <w:pStyle w:val="ListBullet"/>
+      </w:pPr>
+      <w:r>
+        <w:t>Dải chủ đề theo đoạn: bài được cắt thành các đoạn, mỗi đoạn phân loại riêng; nếu dưới 75% nội dung cùng một chủ đề thì cảnh báo bài đa chủ đề/mơ hồ.</w:t>
+      </w:r>
+    </w:p>
+    <w:p>
+      <w:pPr>
+        <w:pStyle w:val="ListBullet"/>
+      </w:pPr>
+      <w:r>
+        <w:t>Phân tích lỗi: trang thống kê liệt kê các bài AI đoán sai nhưng có độ tin cậy cao, kèm liên kết sang AI Lab để xem nguyên nhân.</w:t>
+      </w:r>
+    </w:p>
+    <w:p>
+      <w:pPr>
+        <w:pStyle w:val="Heading1"/>
+      </w:pPr>
+      <w:r>
+        <w:t>7. Hạn chế và hướng phát triển</w:t>
       </w:r>
     </w:p>
     <w:p>
@@ -1583,7 +1641,7 @@
         <w:pStyle w:val="Heading1"/>
       </w:pPr>
       <w:r>
-        <w:t>7. Hướng dẫn chạy</w:t>
+        <w:t>8. Hướng dẫn chạy</w:t>
       </w:r>
     </w:p>
     <w:p>
@@ -1591,6 +1649,8 @@
         <w:t>pip install -r requirements.txt</w:t>
         <w:br/>
         <w:t>python train.py        # huấn luyện + sinh biểu đồ</w:t>
+        <w:br/>
+        <w:t>python app.py          # chạy website tại http://127.0.0.1:5000</w:t>
         <w:br/>
         <w:t>python predict.py "nội dung bài báo"</w:t>
         <w:br/>
@@ -1602,7 +1662,7 @@
         <w:pStyle w:val="Heading1"/>
       </w:pPr>
       <w:r>
-        <w:t>8. Kết luận</w:t>
+        <w:t>9. Kết luận</w:t>
       </w:r>
     </w:p>
     <w:p>

</xml_diff>

<commit_message>
Thêm chức năng ngoài phân loại: tóm tắt TextRank (ROUGE), gom sự kiện KMeans, bản tin 60s, gợi ý bài đọc, hub công cụ AI
Co-Authored-By: Claude Sonnet 5.5 <noreply@anthropic.com>
Claude-Session: https://claude.ai/code/session_01Nj2UpofxGqzA7C2PaZbXvA
</commit_message>
<xml_diff>
--- a/BAO_CAO_DO_AN.docx
+++ b/BAO_CAO_DO_AN.docx
@@ -1543,12 +1543,12 @@
         <w:pStyle w:val="Heading1"/>
       </w:pPr>
       <w:r>
-        <w:t>6. Hệ thống web và chức năng nổi bật</w:t>
+        <w:t>6. Hệ thống web và các chức năng mở rộng</w:t>
       </w:r>
     </w:p>
     <w:p>
       <w:r>
-        <w:t>Mô hình được đóng gói thành website tin tức VnNews (Flask) gồm: trang chủ, 11 chuyên mục, trang đọc bài, tìm kiếm TF-IDF, công cụ phân loại (văn bản/đường link), trang thống kê và giới thiệu. Toàn bộ 5.500 bài được mô hình tự động gán chuyên mục; các chỉ số độ chính xác chỉ tính trên tập kiểm thử.</w:t>
+        <w:t>Ngoài bài toán chính (phân loại), mô hình được đóng gói thành website tin tức VnNews (Flask) với các chức năng dùng những kỹ thuật học máy / xử lý ngôn ngữ khác nhau. Toàn bộ 5.500 bài được mô hình tự động gán chuyên mục; chỉ số độ chính xác chỉ tính trên tập kiểm thử.</w:t>
       </w:r>
     </w:p>
     <w:p>
@@ -1556,12 +1556,219 @@
         <w:pStyle w:val="Heading2"/>
       </w:pPr>
       <w:r>
-        <w:t>6.1 AI Lab – giải thích dự đoán (Explainable AI)</w:t>
+        <w:t>6.1 Tóm tắt tự động (TextRank)</w:t>
       </w:r>
     </w:p>
     <w:p>
       <w:r>
-        <w:t>Điểm khác biệt của đồ án là chức năng giải thích vì sao mô hình chọn một chủ đề. Vì Linear SVM là mô hình tuyến tính, điểm của mỗi chủ đề bằng tổng (trọng số × giá trị TF-IDF) nên có thể tách chính xác phần đóng góp của từng từ và cụm hai từ mà không cần xấp xỉ như LIME/SHAP. Đóng góp của một từ = (trọng số chủ đề dự đoán − trọng số trung bình các chủ đề còn lại) × TF-IDF.</w:t>
+        <w:t>Bài báo được tách thành câu (loại bỏ chú thích ảnh, dòng nguồn), mỗi câu được biểu diễn bằng vector TF-IDF. Đồ thị câu có cạnh là độ tương đồng cosine; chạy PageRank để tìm câu quan trọng nhất, cộng thêm điểm cho câu đầu bài và câu gần tiêu đề. Đây là tóm tắt trích rút nên không bịa thêm nội dung.</w:t>
+      </w:r>
+    </w:p>
+    <w:tbl>
+      <w:tblPr>
+        <w:tblStyle w:val="LightGrid-Accent1"/>
+        <w:tblW w:type="auto" w:w="0"/>
+        <w:tblLook w:firstColumn="1" w:firstRow="1" w:lastColumn="0" w:lastRow="0" w:noHBand="0" w:noVBand="1" w:val="04A0"/>
+      </w:tblPr>
+      <w:tblGrid>
+        <w:gridCol w:w="2160"/>
+        <w:gridCol w:w="2160"/>
+        <w:gridCol w:w="2160"/>
+        <w:gridCol w:w="2160"/>
+      </w:tblGrid>
+      <w:tr>
+        <w:tc>
+          <w:tcPr>
+            <w:tcW w:type="dxa" w:w="2160"/>
+          </w:tcPr>
+          <w:p>
+            <w:r>
+              <w:t>Phương pháp</w:t>
+            </w:r>
+          </w:p>
+        </w:tc>
+        <w:tc>
+          <w:tcPr>
+            <w:tcW w:type="dxa" w:w="2160"/>
+          </w:tcPr>
+          <w:p>
+            <w:r>
+              <w:t>ROUGE-1 F1</w:t>
+            </w:r>
+          </w:p>
+        </w:tc>
+        <w:tc>
+          <w:tcPr>
+            <w:tcW w:type="dxa" w:w="2160"/>
+          </w:tcPr>
+          <w:p>
+            <w:r>
+              <w:t>ROUGE-2 F1</w:t>
+            </w:r>
+          </w:p>
+        </w:tc>
+        <w:tc>
+          <w:tcPr>
+            <w:tcW w:type="dxa" w:w="2160"/>
+          </w:tcPr>
+          <w:p>
+            <w:r>
+              <w:t>Số bài</w:t>
+            </w:r>
+          </w:p>
+        </w:tc>
+      </w:tr>
+      <w:tr>
+        <w:tc>
+          <w:tcPr>
+            <w:tcW w:type="dxa" w:w="2160"/>
+          </w:tcPr>
+          <w:p>
+            <w:r>
+              <w:t>TextRank</w:t>
+            </w:r>
+          </w:p>
+        </w:tc>
+        <w:tc>
+          <w:tcPr>
+            <w:tcW w:type="dxa" w:w="2160"/>
+          </w:tcPr>
+          <w:p>
+            <w:r>
+              <w:t>0.286</w:t>
+            </w:r>
+          </w:p>
+        </w:tc>
+        <w:tc>
+          <w:tcPr>
+            <w:tcW w:type="dxa" w:w="2160"/>
+          </w:tcPr>
+          <w:p>
+            <w:r>
+              <w:t>0.149</w:t>
+            </w:r>
+          </w:p>
+        </w:tc>
+        <w:tc>
+          <w:tcPr>
+            <w:tcW w:type="dxa" w:w="2160"/>
+          </w:tcPr>
+          <w:p>
+            <w:r>
+              <w:t>393</w:t>
+            </w:r>
+          </w:p>
+        </w:tc>
+      </w:tr>
+      <w:tr>
+        <w:tc>
+          <w:tcPr>
+            <w:tcW w:type="dxa" w:w="2160"/>
+          </w:tcPr>
+          <w:p>
+            <w:r>
+              <w:t>Lead-2</w:t>
+            </w:r>
+          </w:p>
+        </w:tc>
+        <w:tc>
+          <w:tcPr>
+            <w:tcW w:type="dxa" w:w="2160"/>
+          </w:tcPr>
+          <w:p>
+            <w:r>
+              <w:t>0.271</w:t>
+            </w:r>
+          </w:p>
+        </w:tc>
+        <w:tc>
+          <w:tcPr>
+            <w:tcW w:type="dxa" w:w="2160"/>
+          </w:tcPr>
+          <w:p>
+            <w:r>
+              <w:t>0.133</w:t>
+            </w:r>
+          </w:p>
+        </w:tc>
+        <w:tc>
+          <w:tcPr>
+            <w:tcW w:type="dxa" w:w="2160"/>
+          </w:tcPr>
+          <w:p>
+            <w:r>
+              <w:t>393</w:t>
+            </w:r>
+          </w:p>
+        </w:tc>
+      </w:tr>
+      <w:tr>
+        <w:tc>
+          <w:tcPr>
+            <w:tcW w:type="dxa" w:w="2160"/>
+          </w:tcPr>
+          <w:p>
+            <w:r>
+              <w:t>Ngẫu nhiên</w:t>
+            </w:r>
+          </w:p>
+        </w:tc>
+        <w:tc>
+          <w:tcPr>
+            <w:tcW w:type="dxa" w:w="2160"/>
+          </w:tcPr>
+          <w:p>
+            <w:r>
+              <w:t>0.214</w:t>
+            </w:r>
+          </w:p>
+        </w:tc>
+        <w:tc>
+          <w:tcPr>
+            <w:tcW w:type="dxa" w:w="2160"/>
+          </w:tcPr>
+          <w:p>
+            <w:r>
+              <w:t>0.085</w:t>
+            </w:r>
+          </w:p>
+        </w:tc>
+        <w:tc>
+          <w:tcPr>
+            <w:tcW w:type="dxa" w:w="2160"/>
+          </w:tcPr>
+          <w:p>
+            <w:r>
+              <w:t>393</w:t>
+            </w:r>
+          </w:p>
+        </w:tc>
+      </w:tr>
+    </w:tbl>
+    <w:p>
+      <w:r>
+        <w:t>Đánh giá trên khoảng 400 bài, lấy phần sapo do biên tập viên viết làm bản tham chiếu (2 câu). TextRank cao hơn cả hai phương pháp cơ sở là Lead-2 (hai câu đầu) và chọn ngẫu nhiên.</w:t>
+      </w:r>
+    </w:p>
+    <w:p>
+      <w:pPr>
+        <w:pStyle w:val="Heading2"/>
+      </w:pPr>
+      <w:r>
+        <w:t>6.2 Gom cụm sự kiện / chủ đề con (học không giám sát)</w:t>
+      </w:r>
+    </w:p>
+    <w:p>
+      <w:r>
+        <w:t>Với mỗi chuyên mục, tiêu đề và sapo được biểu diễn bằng TF-IDF, giảm chiều bằng TruncatedSVD (LSA, 60 chiều) rồi phân cụm KMeans (k bằng số bài chia 26, khoảng 19 cụm mỗi chuyên mục). Tên cụm là các cụm từ đặc trưng nhất của cụm so với phần còn lại của chuyên mục; bài tiêu biểu là bài gần tâm cụm nhất. Phương pháp không dùng nhãn nên bổ sung cho bài toán phân loại có giám sát. Độ gắn kết trung bình (silhouette) là 0.083; giá trị thấp là bình thường với dữ liệu văn bản vì từ vựng giữa các câu chuyện giao thoa nhiều, nhưng nhãn cụm vẫn dễ hiểu (ví dụ “ung thư”, “bóng chuyền”, “ngân hàng”).</w:t>
+      </w:r>
+    </w:p>
+    <w:p>
+      <w:pPr>
+        <w:pStyle w:val="Heading2"/>
+      </w:pPr>
+      <w:r>
+        <w:t>6.3 Gợi ý bài đọc và bản tin nhanh</w:t>
       </w:r>
     </w:p>
     <w:p>
@@ -1569,7 +1776,7 @@
         <w:pStyle w:val="ListBullet"/>
       </w:pPr>
       <w:r>
-        <w:t>Bản đồ nhiệt từ ngữ: mỗi từ trong bài được tô đậm theo mức ủng hộ chủ đề dự đoán; từ đi ngược được gạch chấm.</w:t>
+        <w:t>Gợi ý “Dành cho bạn”: hệ gợi ý dựa trên nội dung (content-based). Vector sở thích là trung bình TF-IDF của các bài người dùng đã đọc (lưu trên trình duyệt); bài được gợi ý là các bài có cosine cao nhất chưa đọc.</w:t>
       </w:r>
     </w:p>
     <w:p>
@@ -1577,7 +1784,7 @@
         <w:pStyle w:val="ListBullet"/>
       </w:pPr>
       <w:r>
-        <w:t>What-if: người dùng bấm bỏ một từ, hệ thống dự đoán lại ngay và cho biết xác suất thay đổi bao nhiêu hoặc chủ đề có bị đổi không (ví dụ bỏ các từ thể thao thì bài chuyển sang Kinh doanh).</w:t>
+        <w:t>Bản tin nhanh 60 giây: tóm tắt hàng loạt, mỗi chuyên mục một tin nổi bật còn 2 câu, hiển thị mức rút gọn nội dung.</w:t>
       </w:r>
     </w:p>
     <w:p>
@@ -1585,15 +1792,20 @@
         <w:pStyle w:val="ListBullet"/>
       </w:pPr>
       <w:r>
-        <w:t>Dải chủ đề theo đoạn: bài được cắt thành các đoạn, mỗi đoạn phân loại riêng; nếu dưới 75% nội dung cùng một chủ đề thì cảnh báo bài đa chủ đề/mơ hồ.</w:t>
+        <w:t>Tìm kiếm: xếp hạng bài theo cosine TF-IDF giữa truy vấn và tiêu đề + sapo.</w:t>
       </w:r>
     </w:p>
     <w:p>
       <w:pPr>
-        <w:pStyle w:val="ListBullet"/>
+        <w:pStyle w:val="Heading2"/>
       </w:pPr>
       <w:r>
-        <w:t>Phân tích lỗi: trang thống kê liệt kê các bài AI đoán sai nhưng có độ tin cậy cao, kèm liên kết sang AI Lab để xem nguyên nhân.</w:t>
+        <w:t>6.4 AI Lab – giải thích dự đoán (Explainable AI)</w:t>
+      </w:r>
+    </w:p>
+    <w:p>
+      <w:r>
+        <w:t>Vì Linear SVM là mô hình tuyến tính nên điểm của mỗi chủ đề bằng tổng (trọng số × giá trị TF-IDF); có thể tách chính xác đóng góp của từng từ mà không cần xấp xỉ như LIME/SHAP. Trang AI Lab tô đậm từng từ theo mức ủng hộ chủ đề dự đoán, cho phép bỏ từ để thử What-if, và phát hiện bài đa chủ đề bằng cách phân loại riêng từng đoạn. Trang thống kê có mục phân tích lỗi các bài AI đoán sai.</w:t>
       </w:r>
     </w:p>
     <w:p>

</xml_diff>

<commit_message>
Thử thách người vs AI (ghi kết quả thật, bảng xếp hạng), nói để phân loại, nghe bản tin, phân loại khi gõ
Co-Authored-By: Claude Sonnet 5.5 <noreply@anthropic.com>
Claude-Session: https://claude.ai/code/session_01Nj2UpofxGqzA7C2PaZbXvA
</commit_message>
<xml_diff>
--- a/BAO_CAO_DO_AN.docx
+++ b/BAO_CAO_DO_AN.docx
@@ -1810,6 +1810,56 @@
     </w:p>
     <w:p>
       <w:pPr>
+        <w:pStyle w:val="Heading2"/>
+      </w:pPr>
+      <w:r>
+        <w:t>6.5 Thử thách: con người so với AI (đánh giá với người dùng)</w:t>
+      </w:r>
+    </w:p>
+    <w:p>
+      <w:r>
+        <w:t>Trang Thử thách cho người dùng đấu 10 lượt với AI. Mỗi lượt hệ thống lấy ngẫu nhiên một bài từ tập kiểm thử (AI chưa từng thấy khi huấn luyện), người chơi xem tiêu đề, sapo và đoạn đầu rồi chọn một trong 11 chuyên mục; sau đó hệ thống hiển thị đáp án và lựa chọn của AI. Mọi lượt chơi được ghi lại (data/arena.jsonl) để thống kê: độ chính xác của người so với AI trên cùng các bài, số lượt chỉ người đúng / chỉ AI đúng / cùng đúng / cùng sai, độ chính xác theo từng chuyên mục, cặp chuyên mục người hay nhầm và bảng xếp hạng. Cách làm này cho một mốc so sánh (human baseline) thật sự, đồng thời cho thấy chuyên mục nào vốn mơ hồ cả với con người (ví dụ Thời sự – Đời sống).</w:t>
+      </w:r>
+    </w:p>
+    <w:p>
+      <w:r>
+        <w:t>Số liệu người chơi thực tế được cập nhật trực tiếp trên trang Thử thách của website (chưa đủ lượt chơi tại thời điểm tạo báo cáo).</w:t>
+      </w:r>
+    </w:p>
+    <w:p>
+      <w:pPr>
+        <w:pStyle w:val="Heading2"/>
+      </w:pPr>
+      <w:r>
+        <w:t>6.6 Nhập bằng giọng nói, đọc bản tin và phân loại khi gõ</w:t>
+      </w:r>
+    </w:p>
+    <w:p>
+      <w:pPr>
+        <w:pStyle w:val="ListBullet"/>
+      </w:pPr>
+      <w:r>
+        <w:t>Nói để phân loại: dùng Web Speech API của trình duyệt (Chrome/Edge, tiếng Việt vi-VN) chuyển giọng nói thành văn bản rồi phân loại ngay.</w:t>
+      </w:r>
+    </w:p>
+    <w:p>
+      <w:pPr>
+        <w:pStyle w:val="ListBullet"/>
+      </w:pPr>
+      <w:r>
+        <w:t>Nghe bản tin / nghe tóm tắt: dùng Speech Synthesis để đọc to bản tin 60 giây và tóm tắt từng bài.</w:t>
+      </w:r>
+    </w:p>
+    <w:p>
+      <w:pPr>
+        <w:pStyle w:val="ListBullet"/>
+      </w:pPr>
+      <w:r>
+        <w:t>Phân loại khi gõ: kết quả cập nhật theo thời gian thực sau mỗi lần ngừng gõ.</w:t>
+      </w:r>
+    </w:p>
+    <w:p>
+      <w:pPr>
         <w:pStyle w:val="Heading1"/>
       </w:pPr>
       <w:r>

</xml_diff>

<commit_message>
Bỏ giọng nói/đọc to; thêm chế độ lớp học (--lan), bảng xếp hạng trực tiếp, kịch bản trình bày
Co-Authored-By: Claude Sonnet 5.5 <noreply@anthropic.com>
Claude-Session: https://claude.ai/code/session_01Nj2UpofxGqzA7C2PaZbXvA
</commit_message>
<xml_diff>
--- a/BAO_CAO_DO_AN.docx
+++ b/BAO_CAO_DO_AN.docx
@@ -1831,7 +1831,7 @@
         <w:pStyle w:val="Heading2"/>
       </w:pPr>
       <w:r>
-        <w:t>6.6 Nhập bằng giọng nói, đọc bản tin và phân loại khi gõ</w:t>
+        <w:t>6.6 Chế độ lớp học và phân loại thời gian thực</w:t>
       </w:r>
     </w:p>
     <w:p>
@@ -1839,7 +1839,7 @@
         <w:pStyle w:val="ListBullet"/>
       </w:pPr>
       <w:r>
-        <w:t>Nói để phân loại: dùng Web Speech API của trình duyệt (Chrome/Edge, tiếng Việt vi-VN) chuyển giọng nói thành văn bản rồi phân loại ngay.</w:t>
+        <w:t>Chế độ lớp học: chạy máy chủ ở chế độ mạng nội bộ (python app.py --lan), cả lớp dùng điện thoại truy cập cùng địa chỉ để chơi Thử thách; màn hình trình chiếu hiển thị bảng xếp hạng và thống kê người so với AI cập nhật trực tiếp.</w:t>
       </w:r>
     </w:p>
     <w:p>
@@ -1847,7 +1847,7 @@
         <w:pStyle w:val="ListBullet"/>
       </w:pPr>
       <w:r>
-        <w:t>Nghe bản tin / nghe tóm tắt: dùng Speech Synthesis để đọc to bản tin 60 giây và tóm tắt từng bài.</w:t>
+        <w:t>Phân loại khi gõ: kết quả cập nhật theo thời gian thực sau mỗi lần ngừng gõ, không cần nhấn nút.</w:t>
       </w:r>
     </w:p>
     <w:p>
@@ -1855,7 +1855,7 @@
         <w:pStyle w:val="ListBullet"/>
       </w:pPr>
       <w:r>
-        <w:t>Phân loại khi gõ: kết quả cập nhật theo thời gian thực sau mỗi lần ngừng gõ.</w:t>
+        <w:t>Toàn bộ chức năng chạy cục bộ, không cần Internet hay thiết bị ngoại vi, nên ổn định khi trình bày.</w:t>
       </w:r>
     </w:p>
     <w:p>

</xml_diff>